<commit_message>
Update student setup guide for consent tick, Hunt/Fish gate, Zone/GPS prompts
The student guide described the old consent flow ("Consent given — start") and
modules "A–I". Updated to the current tick-to-consent + Start, the Hunt/Fish/
Both gate, and the Zone/GPS confirm prompts; regenerated the DOCX.

Co-Authored-By: Claude Opus 4.8 <noreply@anthropic.com>
Claude-Session: https://claude.ai/code/session_01WBADq1mAGXBC8npA3LtAz1
</commit_message>
<xml_diff>
--- a/docs/MCA_Hunt_Student_Setup.docx
+++ b/docs/MCA_Hunt_Student_Setup.docx
@@ -633,24 +633,34 @@
         <w:t xml:space="preserve">Read the consent script aloud.</w:t>
       </w:r>
       <w:r>
-        <w:t xml:space="preserve"> If the person agrees, tap </w:t>
-      </w:r>
-      <w:r>
-        <w:rPr>
-          <w:b/>
-          <w:bCs/>
-        </w:rPr>
-        <w:t xml:space="preserve">“Consent given — start”</w:t>
-      </w:r>
-      <w:r>
-        <w:t xml:space="preserve">. If they do not agree, tap </w:t>
-      </w:r>
-      <w:r>
-        <w:rPr>
-          <w:b/>
-          <w:bCs/>
-        </w:rPr>
-        <w:t xml:space="preserve">“Consent declined — cancel”</w:t>
+        <w:t xml:space="preserve"> If the person agrees, </w:t>
+      </w:r>
+      <w:r>
+        <w:rPr>
+          <w:b/>
+          <w:bCs/>
+        </w:rPr>
+        <w:t xml:space="preserve">tick the consent box</w:t>
+      </w:r>
+      <w:r>
+        <w:t xml:space="preserve"> and tap </w:t>
+      </w:r>
+      <w:r>
+        <w:rPr>
+          <w:b/>
+          <w:bCs/>
+        </w:rPr>
+        <w:t xml:space="preserve">“Start interview”</w:t>
+      </w:r>
+      <w:r>
+        <w:t xml:space="preserve"> (it won’t start without the tick). If they do not agree, tap </w:t>
+      </w:r>
+      <w:r>
+        <w:rPr>
+          <w:b/>
+          <w:bCs/>
+        </w:rPr>
+        <w:t xml:space="preserve">“Declined — cancel”</w:t>
       </w:r>
       <w:r>
         <w:t xml:space="preserve"> — nothing is saved.</w:t>
@@ -666,6 +676,36 @@
         <w:spacing w:after="40"/>
       </w:pPr>
       <w:r>
+        <w:rPr>
+          <w:b/>
+          <w:bCs/>
+        </w:rPr>
+        <w:t xml:space="preserve">Hunt, Fish, or Both?</w:t>
+      </w:r>
+      <w:r>
+        <w:t xml:space="preserve"> Choose on the profile screen. </w:t>
+      </w:r>
+      <w:r>
+        <w:rPr>
+          <w:b/>
+          <w:bCs/>
+        </w:rPr>
+        <w:t xml:space="preserve">“Fishes”</w:t>
+      </w:r>
+      <w:r>
+        <w:t xml:space="preserve"> skips the hunting questions and goes straight to the short fishing section — use it for people (often women) who fish but don’t hunt.</w:t>
+      </w:r>
+    </w:p>
+    <w:p>
+      <w:pPr>
+        <w:pStyle w:val="ListParagraph"/>
+        <w:numPr>
+          <w:ilvl w:val="0"/>
+          <w:numId w:val="6"/>
+        </w:numPr>
+        <w:spacing w:after="40"/>
+      </w:pPr>
+      <w:r>
         <w:t xml:space="preserve">The app fills in Module A automatically:</w:t>
       </w:r>
     </w:p>
@@ -742,7 +782,7 @@
         <w:t xml:space="preserve">Respondent ID</w:t>
       </w:r>
       <w:r>
-        <w:t xml:space="preserve"> appears automatically (e.g. Z01-ABC-001). You never type this yourself.</w:t>
+        <w:t xml:space="preserve"> appears automatically (e.g. Z1-ABC-001). You never type this yourself.</w:t>
       </w:r>
     </w:p>
     <w:p>
@@ -755,17 +795,7 @@
         <w:spacing w:after="40"/>
       </w:pPr>
       <w:r>
-        <w:t xml:space="preserve">Work through the modules </w:t>
-      </w:r>
-      <w:r>
-        <w:rPr>
-          <w:b/>
-          <w:bCs/>
-        </w:rPr>
-        <w:t xml:space="preserve">A → I</w:t>
-      </w:r>
-      <w:r>
-        <w:t xml:space="preserve"> using </w:t>
+        <w:t xml:space="preserve">Work through the modules using </w:t>
       </w:r>
       <w:r>
         <w:rPr>
@@ -785,7 +815,7 @@
         <w:t xml:space="preserve">Back</w:t>
       </w:r>
       <w:r>
-        <w:t xml:space="preserve"> or the round A B C … I buttons at the top to change anything.</w:t>
+        <w:t xml:space="preserve"> or the round letter buttons at the top to change anything. (If a Zone or GPS is missing, the app will ask you to confirm before moving on.)</w:t>
       </w:r>
     </w:p>
     <w:p>

</xml_diff>